<commit_message>
docs(proposals): 사업계획서 v2 갱신 — Seedance 2.0 + AI 3-옵션 prompt 제안
기존 v2의 "3-tier × 3-model" (Kling Stable/Dynamic + Seedance 1 Pro)
매트릭스를 Seedance 2.0 단일 모델 + 사용자 prompt + AI 3-옵션 자동
제안 (럭셔리·다이내믹·글로벌) 으로 갱신.

변경:
- 개요(요약): 혁신성 ⑧ 갱신 + 과제 해결방안 (4)번
- 1-1 알고리즘: Stage 4 영상 부분 Seedance 2.0 + 3-옵션 prompt 설명
- 2-1 모델 표: smart motion prompt → 3-옵션 prompt 제안, Kling 3행
  → Seedance 2.0 단일 row
- 2-1 혁신성 ⑧: Seedance 2.0 + 옵션 A/B/C 톤 가이드 + 비용 표
- 2-2 성능 목표: 9-조합 매트릭스 → Seedance 2.0 + 사용자 입력 방식 3가지
- 3-2 비용 구조: Seedance 2.0 4/5/8/10초 4-row + AI 제안/TTS 옵션 row
- 합계 갱신: \$1.87 (5초) / \$2.39 (8초 권장) / \$2.89 (10초 max)

3종 산출물 (.md/.docx/.html) 동시 재생성.

Co-Authored-By: Claude Opus 4.7 (1M context) <noreply@anthropic.com>
</commit_message>
<xml_diff>
--- a/proposals/AI_Plus_OpenData_사업계획서_v2.docx
+++ b/proposals/AI_Plus_OpenData_사업계획서_v2.docx
@@ -209,7 +209,7 @@
               <w:pStyle w:val="Compact"/>
             </w:pPr>
             <w:r>
-              <w:t xml:space="preserve">(1) 판판대로 지원사업 + 수출바우처 + 기업마당 1,385개 공공 데이터를 OpenAI text-embedding-3-small (1,536d)로 벡터화 후 pgvector 코사인 유사도로 Top-K 후보 추출 → Claude Sonnet 4.6 rerank로 적합도·이유 산출. (2) 매칭 결과를 4종 공공데이터 anchor (Hofstede 6-dim · World Bank 거시지표 · KOTRA korCompList · UN Comtrade)로 grounding한 시장분석 리포트 + 5개국어 × 9-필드 상품기술서 (subtitle·features·target_audience·brand_story·SEO 포함) + 풍부 상세페이지 (detail_specs·scenarios·FAQ) + 3-tier × 3-model 영상 (Tier A 단일 / B 스토리보드 / C +TTS, Model: Kling Stable/Dynamic + Seedance 1 Pro) 자동 생성. (3) im-not-ai 룰북 자동 후처리로 한국어 AI 글의 번역체·기계적 구조를 사람 글로 정정. (4) Job + Polling 비동기 아키텍처 + Supabase Storage 영구 저장 + ?hash= permalink로 6-8분 long-running 영상 안정 처리 + 결과 영구 공유.</w:t>
+              <w:t xml:space="preserve">(1) 판판대로 지원사업 + 수출바우처 + 기업마당 1,385개 공공 데이터를 OpenAI text-embedding-3-small (1,536d)로 벡터화 후 pgvector 코사인 유사도로 Top-K 후보 추출 → Claude Sonnet 4.6 rerank로 적합도·이유 산출. (2) 매칭 결과를 4종 공공데이터 anchor (Hofstede 6-dim · World Bank 거시지표 · KOTRA korCompList · UN Comtrade)로 grounding한 시장분석 리포트 + 5개국어 × 9-필드 상품기술서 (subtitle·features·target_audience·brand_story·SEO 포함) + 풍부 상세페이지 (detail_specs·scenarios·FAQ) + Seedance 2.0 (ByteDance 4K i2v) 영상 (사용자 motion prompt 직접 입력 + AI 3-옵션 자동 제안: 럭셔리/다이내믹/글로벌) 자동 생성. (3) im-not-ai 룰북 자동 후처리로 한국어 AI 글의 번역체·기계적 구조를 사람 글로 정정. (4) Job + Polling 비동기 아키텍처 + Supabase Storage 영구 저장 + ?hash= permalink로 5-8분 long-running 영상 안정 처리 + 결과 영구 공유.</w:t>
             </w:r>
           </w:p>
         </w:tc>
@@ -374,13 +374,25 @@
                 <w:b/>
                 <w:bCs/>
               </w:rPr>
-              <w:t xml:space="preserve">홍보영상 3-tier × 3-model</w:t>
+              <w:t xml:space="preserve">홍보영상 Seedance 2.0 + AI 3-옵션 prompt 제안</w:t>
             </w:r>
             <w:r>
               <w:t xml:space="preserve"> </w:t>
             </w:r>
             <w:r>
-              <w:t xml:space="preserve">— Tier A 단일 / Tier B 3-scene 스토리보드 / Tier C +TTS Nova. Model: Kling Stable / Kling Dynamic / Seedance 1 Pro. smart motion prompt (Haiku) cinematic 자동. ⑨</w:t>
+              <w:t xml:space="preserve">— ByteDance 4K · multimodal · 8초 default. 사용자가 motion prompt 직접 입력 가능. AI 가</w:t>
+            </w:r>
+            <w:r>
+              <w:t xml:space="preserve"> </w:t>
+            </w:r>
+            <w:r>
+              <w:t xml:space="preserve">“럭셔리 오프닝 / 다이내믹 회전 / 글로벌 포용성”</w:t>
+            </w:r>
+            <w:r>
+              <w:t xml:space="preserve"> </w:t>
+            </w:r>
+            <w:r>
+              <w:t xml:space="preserve">3가지 옵션 자동 제안 (Apple/Burberry 톤). 미입력 시 옵션 A 자동. ⑨</w:t>
             </w:r>
             <w:r>
               <w:t xml:space="preserve"> </w:t>
@@ -838,7 +850,7 @@
         <w:rPr>
           <w:rStyle w:val="VerbatimChar"/>
         </w:rPr>
-        <w:t xml:space="preserve">    · 홍보영상 — 3-tier × 3-model selector (사용자 선택):</w:t>
+        <w:t xml:space="preserve">    · 홍보영상 — Seedance 2.0 (ByteDance, 4K · multimodal · 8초 default)</w:t>
       </w:r>
       <w:r>
         <w:br/>
@@ -847,7 +859,7 @@
         <w:rPr>
           <w:rStyle w:val="VerbatimChar"/>
         </w:rPr>
-        <w:t xml:space="preserve">       Tier A 단일 클립 / Tier B 3-scene 스토리보드 (제품 리빌·시나리오·</w:t>
+        <w:t xml:space="preserve">       단일 모델. 사용자가 motion prompt 직접 입력 가능. 이미지 + 제품</w:t>
       </w:r>
       <w:r>
         <w:br/>
@@ -856,7 +868,7 @@
         <w:rPr>
           <w:rStyle w:val="VerbatimChar"/>
         </w:rPr>
-        <w:t xml:space="preserve">       클로즈업) / Tier C +OpenAI TTS Nova 한국어 보이스오버.</w:t>
+        <w:t xml:space="preserve">       정보 기반으로 AI 가 3가지 prompt 옵션 자동 제안:</w:t>
       </w:r>
       <w:r>
         <w:br/>
@@ -865,7 +877,7 @@
         <w:rPr>
           <w:rStyle w:val="VerbatimChar"/>
         </w:rPr>
-        <w:t xml:space="preserve">       Model: Kling v1.6 Pro Stable / Kling v1.6 Pro Dynamic (cfg 0.5) /</w:t>
+        <w:t xml:space="preserve">         · 옵션 A 럭셔리 오프닝 (시네마틱 매크로 돌리인, 안전·추천)</w:t>
       </w:r>
       <w:r>
         <w:br/>
@@ -874,7 +886,7 @@
         <w:rPr>
           <w:rStyle w:val="VerbatimChar"/>
         </w:rPr>
-        <w:t xml:space="preserve">       Seedance 1 Pro (ByteDance, cinematic motion).</w:t>
+        <w:t xml:space="preserve">         · 옵션 B 다이내믹 회전 (360 오빗 + 슬로모션, SNS·숏폼)</w:t>
       </w:r>
       <w:r>
         <w:br/>
@@ -883,7 +895,7 @@
         <w:rPr>
           <w:rStyle w:val="VerbatimChar"/>
         </w:rPr>
-        <w:t xml:space="preserve">       Job + polling 아키텍처로 6-8분 long-running 응답 안정 처리,</w:t>
+        <w:t xml:space="preserve">         · 옵션 C 글로벌 포용성 (클린 미니멀 트래킹, 수출 바우처 톤)</w:t>
       </w:r>
       <w:r>
         <w:br/>
@@ -892,7 +904,34 @@
         <w:rPr>
           <w:rStyle w:val="VerbatimChar"/>
         </w:rPr>
-        <w:t xml:space="preserve">       Supabase Storage 영구 저장, 클립별 다운로드/URL 복사 버튼.</w:t>
+        <w:t xml:space="preserve">       사용자가 옵션 카드 클릭 시 textarea 자동 채움. 미입력 시 옵션 A</w:t>
+      </w:r>
+      <w:r>
+        <w:br/>
+      </w:r>
+      <w:r>
+        <w:rPr>
+          <w:rStyle w:val="VerbatimChar"/>
+        </w:rPr>
+        <w:t xml:space="preserve">       자동 적용. Duration 4/5/8/10초, Aspect 16:9·9:16·1:1, 한국어 TTS</w:t>
+      </w:r>
+      <w:r>
+        <w:br/>
+      </w:r>
+      <w:r>
+        <w:rPr>
+          <w:rStyle w:val="VerbatimChar"/>
+        </w:rPr>
+        <w:t xml:space="preserve">       보이스오버 토글. Job + polling 아키텍처로 5-8분 long-running 응답</w:t>
+      </w:r>
+      <w:r>
+        <w:br/>
+      </w:r>
+      <w:r>
+        <w:rPr>
+          <w:rStyle w:val="VerbatimChar"/>
+        </w:rPr>
+        <w:t xml:space="preserve">       안정 처리, Supabase Storage 영구 저장, 다운로드/URL 복사 버튼.</w:t>
       </w:r>
       <w:r>
         <w:br/>
@@ -1937,7 +1976,7 @@
               <w:pStyle w:val="Compact"/>
             </w:pPr>
             <w:r>
-              <w:t xml:space="preserve">영상 motion prompt (smart)</w:t>
+              <w:t xml:space="preserve">영상 motion prompt 3-옵션 제안</w:t>
             </w:r>
           </w:p>
         </w:tc>
@@ -1959,55 +1998,71 @@
               <w:pStyle w:val="Compact"/>
             </w:pPr>
             <w:r>
-              <w:t xml:space="preserve">제품별 자동 cinematic prompt 생성 (~$0.003/회)</w:t>
-            </w:r>
-          </w:p>
-        </w:tc>
-      </w:tr>
-      <w:tr>
-        <w:tc>
-          <w:tcPr/>
-          <w:p>
-            <w:pPr>
-              <w:pStyle w:val="Compact"/>
-            </w:pPr>
-            <w:r>
-              <w:t xml:space="preserve">홍보영상 (3-model 선택)</w:t>
-            </w:r>
-          </w:p>
-        </w:tc>
-        <w:tc>
-          <w:tcPr/>
-          <w:p>
-            <w:pPr>
-              <w:pStyle w:val="Compact"/>
-            </w:pPr>
-            <w:r>
-              <w:t xml:space="preserve">Kling v1.6 Pro Stable / Dynamic / Seedance 1 Pro</w:t>
-            </w:r>
-          </w:p>
-        </w:tc>
-        <w:tc>
-          <w:tcPr/>
-          <w:p>
-            <w:pPr>
-              <w:pStyle w:val="Compact"/>
-            </w:pPr>
-            <w:r>
-              <w:t xml:space="preserve">사용자 비교 후 선택. Stable=안정, Dynamic=cinematic, Seedance=최상위 motion</w:t>
-            </w:r>
-          </w:p>
-        </w:tc>
-      </w:tr>
-      <w:tr>
-        <w:tc>
-          <w:tcPr/>
-          <w:p>
-            <w:pPr>
-              <w:pStyle w:val="Compact"/>
-            </w:pPr>
-            <w:r>
-              <w:t xml:space="preserve">TTS 보이스오버 (Tier C)</w:t>
+              <w:t xml:space="preserve">럭셔리·다이내믹·글로벌 3가지 cinematic prompt 자동 (~$0.003/회)</w:t>
+            </w:r>
+          </w:p>
+        </w:tc>
+      </w:tr>
+      <w:tr>
+        <w:tc>
+          <w:tcPr/>
+          <w:p>
+            <w:pPr>
+              <w:pStyle w:val="Compact"/>
+            </w:pPr>
+            <w:r>
+              <w:t xml:space="preserve">홍보영상 (단일 모델)</w:t>
+            </w:r>
+          </w:p>
+        </w:tc>
+        <w:tc>
+          <w:tcPr/>
+          <w:p>
+            <w:pPr>
+              <w:pStyle w:val="Compact"/>
+            </w:pPr>
+            <w:r>
+              <w:t xml:space="preserve">ByteDance</w:t>
+            </w:r>
+            <w:r>
+              <w:t xml:space="preserve"> </w:t>
+            </w:r>
+            <w:r>
+              <w:rPr>
+                <w:b/>
+                <w:bCs/>
+              </w:rPr>
+              <w:t xml:space="preserve">Seedance 2.0</w:t>
+            </w:r>
+            <w:r>
+              <w:t xml:space="preserve"> </w:t>
+            </w:r>
+            <w:r>
+              <w:t xml:space="preserve">(Replicate)</w:t>
+            </w:r>
+          </w:p>
+        </w:tc>
+        <w:tc>
+          <w:tcPr/>
+          <w:p>
+            <w:pPr>
+              <w:pStyle w:val="Compact"/>
+            </w:pPr>
+            <w:r>
+              <w:t xml:space="preserve">2025 출시. 4K·multimodal·8초 default. 사용자 prompt 우선 / 미입력 시 옵션 A 자동</w:t>
+            </w:r>
+          </w:p>
+        </w:tc>
+      </w:tr>
+      <w:tr>
+        <w:tc>
+          <w:tcPr/>
+          <w:p>
+            <w:pPr>
+              <w:pStyle w:val="Compact"/>
+            </w:pPr>
+            <w:r>
+              <w:t xml:space="preserve">TTS 보이스오버 (선택)</w:t>
             </w:r>
           </w:p>
         </w:tc>
@@ -2842,7 +2897,7 @@
           <w:b/>
           <w:bCs/>
         </w:rPr>
-        <w:t xml:space="preserve">⑧ 홍보영상 3-tier × 3-model selector (사용자 선택)</w:t>
+        <w:t xml:space="preserve">⑧ Seedance 2.0 + 사용자 prompt + AI 3-옵션 자동 제안</w:t>
       </w:r>
     </w:p>
     <w:p>
@@ -2850,7 +2905,41 @@
         <w:pStyle w:val="BodyText"/>
       </w:pPr>
       <w:r>
-        <w:t xml:space="preserve">홍보영상 콘텐츠는 단일 모델 의존이 아닌 3 tier × 3 model 매트릭스로 사용자가 직접 선택:</w:t>
+        <w:t xml:space="preserve">홍보영상 콘텐츠는 ByteDance Seedance 2.0 단일 모델 (4K · multimodal · 8초 default) — 2025 출시 i2v 모델 중 motion handling 최상위 평가.</w:t>
+      </w:r>
+    </w:p>
+    <w:p>
+      <w:pPr>
+        <w:pStyle w:val="BodyText"/>
+      </w:pPr>
+      <w:r>
+        <w:rPr>
+          <w:b/>
+          <w:bCs/>
+        </w:rPr>
+        <w:t xml:space="preserve">사용자 prompt 직접 입력</w:t>
+      </w:r>
+      <w:r>
+        <w:t xml:space="preserve"> </w:t>
+      </w:r>
+      <w:r>
+        <w:t xml:space="preserve">+</w:t>
+      </w:r>
+      <w:r>
+        <w:t xml:space="preserve"> </w:t>
+      </w:r>
+      <w:r>
+        <w:rPr>
+          <w:b/>
+          <w:bCs/>
+        </w:rPr>
+        <w:t xml:space="preserve">AI 가 3가지 옵션 자동 제안</w:t>
+      </w:r>
+      <w:r>
+        <w:t xml:space="preserve"> </w:t>
+      </w:r>
+      <w:r>
+        <w:t xml:space="preserve">하이브리드:</w:t>
       </w:r>
     </w:p>
     <w:tbl>
@@ -2876,29 +2965,29 @@
               <w:pStyle w:val="Compact"/>
             </w:pPr>
             <w:r>
-              <w:t xml:space="preserve">Tier</w:t>
-            </w:r>
-          </w:p>
-        </w:tc>
-        <w:tc>
-          <w:tcPr/>
-          <w:p>
-            <w:pPr>
-              <w:pStyle w:val="Compact"/>
-            </w:pPr>
-            <w:r>
-              <w:t xml:space="preserve">출력</w:t>
-            </w:r>
-          </w:p>
-        </w:tc>
-        <w:tc>
-          <w:tcPr/>
-          <w:p>
-            <w:pPr>
-              <w:pStyle w:val="Compact"/>
-            </w:pPr>
-            <w:r>
-              <w:t xml:space="preserve">비용 (5초/10초)</w:t>
+              <w:t xml:space="preserve">옵션</w:t>
+            </w:r>
+          </w:p>
+        </w:tc>
+        <w:tc>
+          <w:tcPr/>
+          <w:p>
+            <w:pPr>
+              <w:pStyle w:val="Compact"/>
+            </w:pPr>
+            <w:r>
+              <w:t xml:space="preserve">톤</w:t>
+            </w:r>
+          </w:p>
+        </w:tc>
+        <w:tc>
+          <w:tcPr/>
+          <w:p>
+            <w:pPr>
+              <w:pStyle w:val="Compact"/>
+            </w:pPr>
+            <w:r>
+              <w:t xml:space="preserve">사용처</w:t>
             </w:r>
           </w:p>
         </w:tc>
@@ -2915,80 +3004,39 @@
                 <w:b/>
                 <w:bCs/>
               </w:rPr>
-              <w:t xml:space="preserve">A</w:t>
+              <w:t xml:space="preserve">A — 럭셔리 오프닝</w:t>
+            </w:r>
+          </w:p>
+        </w:tc>
+        <w:tc>
+          <w:tcPr/>
+          <w:p>
+            <w:pPr>
+              <w:pStyle w:val="Compact"/>
+            </w:pPr>
+            <w:r>
+              <w:t xml:space="preserve">시네마틱 매크로 돌리인, 골든 림 라이트, 슬로 reveal</w:t>
+            </w:r>
+          </w:p>
+        </w:tc>
+        <w:tc>
+          <w:tcPr/>
+          <w:p>
+            <w:pPr>
+              <w:pStyle w:val="Compact"/>
+            </w:pPr>
+            <w:r>
+              <w:t xml:space="preserve">Apple/Burberry 톤 광고.</w:t>
             </w:r>
             <w:r>
               <w:t xml:space="preserve"> </w:t>
             </w:r>
-            <w:r>
-              <w:t xml:space="preserve">단일 클립</w:t>
-            </w:r>
-          </w:p>
-        </w:tc>
-        <w:tc>
-          <w:tcPr/>
-          <w:p>
-            <w:pPr>
-              <w:pStyle w:val="Compact"/>
-            </w:pPr>
-            <w:r>
-              <w:t xml:space="preserve">smart motion prompt + 단일 영상</w:t>
-            </w:r>
-          </w:p>
-        </w:tc>
-        <w:tc>
-          <w:tcPr/>
-          <w:p>
-            <w:pPr>
-              <w:pStyle w:val="Compact"/>
-            </w:pPr>
-            <w:r>
-              <w:t xml:space="preserve">$0.50 / $1.00</w:t>
-            </w:r>
-          </w:p>
-        </w:tc>
-      </w:tr>
-      <w:tr>
-        <w:tc>
-          <w:tcPr/>
-          <w:p>
-            <w:pPr>
-              <w:pStyle w:val="Compact"/>
-            </w:pPr>
             <w:r>
               <w:rPr>
                 <w:b/>
                 <w:bCs/>
               </w:rPr>
-              <w:t xml:space="preserve">B</w:t>
-            </w:r>
-            <w:r>
-              <w:t xml:space="preserve"> </w:t>
-            </w:r>
-            <w:r>
-              <w:t xml:space="preserve">3-scene 스토리보드</w:t>
-            </w:r>
-          </w:p>
-        </w:tc>
-        <w:tc>
-          <w:tcPr/>
-          <w:p>
-            <w:pPr>
-              <w:pStyle w:val="Compact"/>
-            </w:pPr>
-            <w:r>
-              <w:t xml:space="preserve">제품 리빌 → 사용 시나리오 → 클로즈업 (sequential)</w:t>
-            </w:r>
-          </w:p>
-        </w:tc>
-        <w:tc>
-          <w:tcPr/>
-          <w:p>
-            <w:pPr>
-              <w:pStyle w:val="Compact"/>
-            </w:pPr>
-            <w:r>
-              <w:t xml:space="preserve">$1.50 / $3.00</w:t>
+              <w:t xml:space="preserve">안전·추천 (default)</w:t>
             </w:r>
           </w:p>
         </w:tc>
@@ -3005,41 +3053,478 @@
                 <w:b/>
                 <w:bCs/>
               </w:rPr>
-              <w:t xml:space="preserve">C</w:t>
+              <w:t xml:space="preserve">B — 다이내믹 회전</w:t>
+            </w:r>
+          </w:p>
+        </w:tc>
+        <w:tc>
+          <w:tcPr/>
+          <w:p>
+            <w:pPr>
+              <w:pStyle w:val="Compact"/>
+            </w:pPr>
+            <w:r>
+              <w:t xml:space="preserve">360° 오빗, 슬로모션 디테일, 강렬 컬러 팔레트</w:t>
+            </w:r>
+          </w:p>
+        </w:tc>
+        <w:tc>
+          <w:tcPr/>
+          <w:p>
+            <w:pPr>
+              <w:pStyle w:val="Compact"/>
+            </w:pPr>
+            <w:r>
+              <w:t xml:space="preserve">TikTok·Reels 숏폼, SNS 바이럴</w:t>
+            </w:r>
+          </w:p>
+        </w:tc>
+      </w:tr>
+      <w:tr>
+        <w:tc>
+          <w:tcPr/>
+          <w:p>
+            <w:pPr>
+              <w:pStyle w:val="Compact"/>
+            </w:pPr>
+            <w:r>
+              <w:rPr>
+                <w:b/>
+                <w:bCs/>
+              </w:rPr>
+              <w:t xml:space="preserve">C — 글로벌 포용성</w:t>
+            </w:r>
+          </w:p>
+        </w:tc>
+        <w:tc>
+          <w:tcPr/>
+          <w:p>
+            <w:pPr>
+              <w:pStyle w:val="Compact"/>
+            </w:pPr>
+            <w:r>
+              <w:t xml:space="preserve">와이드 트래킹, 다양 사용 시나리오, 클린 미니멀</w:t>
+            </w:r>
+          </w:p>
+        </w:tc>
+        <w:tc>
+          <w:tcPr/>
+          <w:p>
+            <w:pPr>
+              <w:pStyle w:val="Compact"/>
+            </w:pPr>
+            <w:r>
+              <w:t xml:space="preserve">수출 바우처·정부 사업 톤, 다양성 강조</w:t>
+            </w:r>
+          </w:p>
+        </w:tc>
+      </w:tr>
+    </w:tbl>
+    <w:p>
+      <w:pPr>
+        <w:pStyle w:val="BodyText"/>
+      </w:pPr>
+      <w:r>
+        <w:t xml:space="preserve">이미지 + 제품 정보 입력 → Claude Haiku 가 위 3개 prompt 한국어로 자동 생성 (~$0.003). 사용자가 카드 클릭 시 textarea 자동 채움. 미입력 시 옵션 A 자동 적용.</w:t>
+      </w:r>
+    </w:p>
+    <w:p>
+      <w:pPr>
+        <w:pStyle w:val="BodyText"/>
+      </w:pPr>
+      <w:r>
+        <w:rPr>
+          <w:b/>
+          <w:bCs/>
+        </w:rPr>
+        <w:t xml:space="preserve">Seedance 2.0 비용</w:t>
+      </w:r>
+      <w:r>
+        <w:t xml:space="preserve"> </w:t>
+      </w:r>
+      <w:r>
+        <w:t xml:space="preserve">(Replicate 기준):</w:t>
+      </w:r>
+    </w:p>
+    <w:tbl>
+      <w:tblPr>
+        <w:tblStyle w:val="Table"/>
+        <w:tblW w:type="auto" w:w="0"/>
+        <w:tblLook w:firstRow="1" w:lastRow="0" w:firstColumn="0" w:lastColumn="0" w:noHBand="0" w:noVBand="0" w:val="0020"/>
+      </w:tblPr>
+      <w:tblGrid>
+        <w:gridCol w:w="3960"/>
+        <w:gridCol w:w="3960"/>
+      </w:tblGrid>
+      <w:tr>
+        <w:trPr>
+          <w:tblHeader w:val="on"/>
+        </w:trPr>
+        <w:tc>
+          <w:tcPr/>
+          <w:p>
+            <w:pPr>
+              <w:pStyle w:val="Compact"/>
+            </w:pPr>
+            <w:r>
+              <w:t xml:space="preserve">Duration</w:t>
+            </w:r>
+          </w:p>
+        </w:tc>
+        <w:tc>
+          <w:tcPr/>
+          <w:p>
+            <w:pPr>
+              <w:pStyle w:val="Compact"/>
+            </w:pPr>
+            <w:r>
+              <w:t xml:space="preserve">비용</w:t>
+            </w:r>
+          </w:p>
+        </w:tc>
+      </w:tr>
+      <w:tr>
+        <w:tc>
+          <w:tcPr/>
+          <w:p>
+            <w:pPr>
+              <w:pStyle w:val="Compact"/>
+            </w:pPr>
+            <w:r>
+              <w:t xml:space="preserve">4초</w:t>
+            </w:r>
+          </w:p>
+        </w:tc>
+        <w:tc>
+          <w:tcPr/>
+          <w:p>
+            <w:pPr>
+              <w:pStyle w:val="Compact"/>
+            </w:pPr>
+            <w:r>
+              <w:t xml:space="preserve">$1.20</w:t>
+            </w:r>
+          </w:p>
+        </w:tc>
+      </w:tr>
+      <w:tr>
+        <w:tc>
+          <w:tcPr/>
+          <w:p>
+            <w:pPr>
+              <w:pStyle w:val="Compact"/>
+            </w:pPr>
+            <w:r>
+              <w:t xml:space="preserve">5초</w:t>
+            </w:r>
+          </w:p>
+        </w:tc>
+        <w:tc>
+          <w:tcPr/>
+          <w:p>
+            <w:pPr>
+              <w:pStyle w:val="Compact"/>
+            </w:pPr>
+            <w:r>
+              <w:t xml:space="preserve">$1.50</w:t>
+            </w:r>
+          </w:p>
+        </w:tc>
+      </w:tr>
+      <w:tr>
+        <w:tc>
+          <w:tcPr/>
+          <w:p>
+            <w:pPr>
+              <w:pStyle w:val="Compact"/>
+            </w:pPr>
+            <w:r>
+              <w:rPr>
+                <w:b/>
+                <w:bCs/>
+              </w:rPr>
+              <w:t xml:space="preserve">8초</w:t>
             </w:r>
             <w:r>
               <w:t xml:space="preserve"> </w:t>
             </w:r>
             <w:r>
-              <w:t xml:space="preserve">+ TTS 보이스오버</w:t>
-            </w:r>
-          </w:p>
-        </w:tc>
-        <w:tc>
-          <w:tcPr/>
-          <w:p>
-            <w:pPr>
-              <w:pStyle w:val="Compact"/>
-            </w:pPr>
-            <w:r>
-              <w:t xml:space="preserve">Tier B + OpenAI TTS Nova 한국어 음성</w:t>
-            </w:r>
-          </w:p>
-        </w:tc>
-        <w:tc>
-          <w:tcPr/>
-          <w:p>
-            <w:pPr>
-              <w:pStyle w:val="Compact"/>
-            </w:pPr>
-            <w:r>
-              <w:t xml:space="preserve">~$1.50 / ~$3.00</w:t>
+              <w:t xml:space="preserve">(default)</w:t>
+            </w:r>
+          </w:p>
+        </w:tc>
+        <w:tc>
+          <w:tcPr/>
+          <w:p>
+            <w:pPr>
+              <w:pStyle w:val="Compact"/>
+            </w:pPr>
+            <w:r>
+              <w:rPr>
+                <w:b/>
+                <w:bCs/>
+              </w:rPr>
+              <w:t xml:space="preserve">$2.00</w:t>
+            </w:r>
+          </w:p>
+        </w:tc>
+      </w:tr>
+      <w:tr>
+        <w:tc>
+          <w:tcPr/>
+          <w:p>
+            <w:pPr>
+              <w:pStyle w:val="Compact"/>
+            </w:pPr>
+            <w:r>
+              <w:t xml:space="preserve">10초</w:t>
+            </w:r>
+          </w:p>
+        </w:tc>
+        <w:tc>
+          <w:tcPr/>
+          <w:p>
+            <w:pPr>
+              <w:pStyle w:val="Compact"/>
+            </w:pPr>
+            <w:r>
+              <w:t xml:space="preserve">$2.50</w:t>
+            </w:r>
+          </w:p>
+        </w:tc>
+      </w:tr>
+      <w:tr>
+        <w:tc>
+          <w:tcPr/>
+          <w:p>
+            <w:pPr>
+              <w:pStyle w:val="Compact"/>
+            </w:pPr>
+            <w:r>
+              <w:t xml:space="preserve">+ AI 3-옵션 제안 (Haiku)</w:t>
+            </w:r>
+          </w:p>
+        </w:tc>
+        <w:tc>
+          <w:tcPr/>
+          <w:p>
+            <w:pPr>
+              <w:pStyle w:val="Compact"/>
+            </w:pPr>
+            <w:r>
+              <w:t xml:space="preserve">+$0.003</w:t>
+            </w:r>
+          </w:p>
+        </w:tc>
+      </w:tr>
+      <w:tr>
+        <w:tc>
+          <w:tcPr/>
+          <w:p>
+            <w:pPr>
+              <w:pStyle w:val="Compact"/>
+            </w:pPr>
+            <w:r>
+              <w:t xml:space="preserve">+ 한국어 TTS 보이스오버 (Nova)</w:t>
+            </w:r>
+          </w:p>
+        </w:tc>
+        <w:tc>
+          <w:tcPr/>
+          <w:p>
+            <w:pPr>
+              <w:pStyle w:val="Compact"/>
+            </w:pPr>
+            <w:r>
+              <w:t xml:space="preserve">+$0.005</w:t>
             </w:r>
           </w:p>
         </w:tc>
       </w:tr>
     </w:tbl>
-    <w:p/>
+    <w:p>
+      <w:pPr>
+        <w:pStyle w:val="BodyText"/>
+      </w:pPr>
+      <w:r>
+        <w:t xml:space="preserve">Aspect ratio 16:9 / 9:16 / 1:1 모두 지원. resolution 1080p (4K 옵션 협의).</w:t>
+      </w:r>
+    </w:p>
+    <w:p>
+      <w:pPr>
+        <w:pStyle w:val="BodyText"/>
+      </w:pPr>
+      <w:r>
+        <w:rPr>
+          <w:b/>
+          <w:bCs/>
+        </w:rPr>
+        <w:t xml:space="preserve">⑨ Job + Polling 비동기 아키텍처 + 영구 저장 (production-ready)</w:t>
+      </w:r>
+    </w:p>
+    <w:p>
+      <w:pPr>
+        <w:pStyle w:val="BodyText"/>
+      </w:pPr>
+      <w:r>
+        <w:t xml:space="preserve">6-8분짜리 long-running 영상 생성을 단일 HTTP 요청으로 처리하면 브라우저·edge proxy idle timeout (보통 60-300s) 으로</w:t>
+      </w:r>
+      <w:r>
+        <w:t xml:space="preserve"> </w:t>
+      </w:r>
+      <w:r>
+        <w:t xml:space="preserve">“Failed to fetch”</w:t>
+      </w:r>
+      <w:r>
+        <w:t xml:space="preserve"> </w:t>
+      </w:r>
+      <w:r>
+        <w:t xml:space="preserve">발생. 본 시스템은 다음 아키텍처:</w:t>
+      </w:r>
+    </w:p>
+    <w:p>
+      <w:pPr>
+        <w:pStyle w:val="Compact"/>
+        <w:numPr>
+          <w:ilvl w:val="0"/>
+          <w:numId w:val="1007"/>
+        </w:numPr>
+      </w:pPr>
+      <w:r>
+        <w:rPr>
+          <w:b/>
+          <w:bCs/>
+        </w:rPr>
+        <w:t xml:space="preserve">POST /api/challenge/video</w:t>
+      </w:r>
+      <w:r>
+        <w:t xml:space="preserve"> </w:t>
+      </w:r>
+      <w:r>
+        <w:t xml:space="preserve">(~30s) — Replicate prediction 생성만 후 즉시</w:t>
+      </w:r>
+      <w:r>
+        <w:t xml:space="preserve"> </w:t>
+      </w:r>
+      <w:r>
+        <w:rPr>
+          <w:rStyle w:val="VerbatimChar"/>
+        </w:rPr>
+        <w:t xml:space="preserve">job_id</w:t>
+      </w:r>
+      <w:r>
+        <w:t xml:space="preserve"> </w:t>
+      </w:r>
+      <w:r>
+        <w:t xml:space="preserve">반환</w:t>
+      </w:r>
+    </w:p>
+    <w:p>
+      <w:pPr>
+        <w:pStyle w:val="Compact"/>
+        <w:numPr>
+          <w:ilvl w:val="0"/>
+          <w:numId w:val="1007"/>
+        </w:numPr>
+      </w:pPr>
+      <w:r>
+        <w:rPr>
+          <w:b/>
+          <w:bCs/>
+        </w:rPr>
+        <w:t xml:space="preserve">GET /api/challenge/video/status?job_id=…</w:t>
+      </w:r>
+      <w:r>
+        <w:t xml:space="preserve"> </w:t>
+      </w:r>
+      <w:r>
+        <w:t xml:space="preserve">(~2s) — 클라이언트가 5초마다 polling</w:t>
+      </w:r>
+    </w:p>
+    <w:p>
+      <w:pPr>
+        <w:pStyle w:val="Compact"/>
+        <w:numPr>
+          <w:ilvl w:val="0"/>
+          <w:numId w:val="1007"/>
+        </w:numPr>
+      </w:pPr>
+      <w:r>
+        <w:rPr>
+          <w:b/>
+          <w:bCs/>
+        </w:rPr>
+        <w:t xml:space="preserve">Supabase Storage 영구 저장</w:t>
+      </w:r>
+      <w:r>
+        <w:t xml:space="preserve"> </w:t>
+      </w:r>
+      <w:r>
+        <w:t xml:space="preserve">— Replicate URL은 24h 후 만료 → 우리 storage로 mirror</w:t>
+      </w:r>
+    </w:p>
+    <w:p>
+      <w:pPr>
+        <w:pStyle w:val="Compact"/>
+        <w:numPr>
+          <w:ilvl w:val="0"/>
+          <w:numId w:val="1007"/>
+        </w:numPr>
+      </w:pPr>
+      <w:r>
+        <w:rPr>
+          <w:b/>
+          <w:bCs/>
+        </w:rPr>
+        <w:t xml:space="preserve">각 클립 다운로드/URL 복사 버튼</w:t>
+      </w:r>
+      <w:r>
+        <w:t xml:space="preserve"> </w:t>
+      </w:r>
+      <w:r>
+        <w:t xml:space="preserve">— 마케팅·SNS·발표 자료로 즉시 활용</w:t>
+      </w:r>
+    </w:p>
+    <w:p>
+      <w:pPr>
+        <w:pStyle w:val="Compact"/>
+        <w:numPr>
+          <w:ilvl w:val="0"/>
+          <w:numId w:val="1007"/>
+        </w:numPr>
+      </w:pPr>
+      <w:r>
+        <w:rPr>
+          <w:b/>
+          <w:bCs/>
+        </w:rPr>
+        <w:t xml:space="preserve">history 페이지 + ?hash= permalink</w:t>
+      </w:r>
+      <w:r>
+        <w:t xml:space="preserve"> </w:t>
+      </w:r>
+      <w:r>
+        <w:t xml:space="preserve">— 새로고침/북마크/공유 URL로 동일 결과 즉시 복원 (LLM 재호출 0)</w:t>
+      </w:r>
+    </w:p>
+    <w:p>
+      <w:pPr>
+        <w:pStyle w:val="FirstParagraph"/>
+      </w:pPr>
+      <w:r>
+        <w:t xml:space="preserve">이로써 challenge demo·심사위원 시연·실 사용자 모두 long-running 작업이 안정적으로 완료·공유 가능.</w:t>
+      </w:r>
+    </w:p>
+    <w:bookmarkEnd w:id="13"/>
+    <w:bookmarkStart w:id="14" w:name="최종-완성될-결과물의-성능-목표"/>
+    <w:p>
+      <w:pPr>
+        <w:pStyle w:val="Heading3"/>
+      </w:pPr>
+      <w:r>
+        <w:t xml:space="preserve">2-2. 최종 완성될 결과물의 성능 목표</w:t>
+      </w:r>
+    </w:p>
     <w:tbl>
       <w:tblPr>
         <w:tblStyle w:val="Table"/>
@@ -3063,369 +3548,6 @@
               <w:pStyle w:val="Compact"/>
             </w:pPr>
             <w:r>
-              <w:t xml:space="preserve">Model</w:t>
-            </w:r>
-          </w:p>
-        </w:tc>
-        <w:tc>
-          <w:tcPr/>
-          <w:p>
-            <w:pPr>
-              <w:pStyle w:val="Compact"/>
-            </w:pPr>
-            <w:r>
-              <w:t xml:space="preserve">특징</w:t>
-            </w:r>
-          </w:p>
-        </w:tc>
-        <w:tc>
-          <w:tcPr/>
-          <w:p>
-            <w:pPr>
-              <w:pStyle w:val="Compact"/>
-            </w:pPr>
-            <w:r>
-              <w:t xml:space="preserve">추가 비용</w:t>
-            </w:r>
-          </w:p>
-        </w:tc>
-      </w:tr>
-      <w:tr>
-        <w:tc>
-          <w:tcPr/>
-          <w:p>
-            <w:pPr>
-              <w:pStyle w:val="Compact"/>
-            </w:pPr>
-            <w:r>
-              <w:rPr>
-                <w:b/>
-                <w:bCs/>
-              </w:rPr>
-              <w:t xml:space="preserve">Kling v1.6 Pro Stable</w:t>
-            </w:r>
-          </w:p>
-        </w:tc>
-        <w:tc>
-          <w:tcPr/>
-          <w:p>
-            <w:pPr>
-              <w:pStyle w:val="Compact"/>
-            </w:pPr>
-            <w:r>
-              <w:t xml:space="preserve">cfg=0.8, 텍스트 보존 우선, 안정적</w:t>
-            </w:r>
-          </w:p>
-        </w:tc>
-        <w:tc>
-          <w:tcPr/>
-          <w:p>
-            <w:pPr>
-              <w:pStyle w:val="Compact"/>
-            </w:pPr>
-            <w:r>
-              <w:t xml:space="preserve">기본</w:t>
-            </w:r>
-          </w:p>
-        </w:tc>
-      </w:tr>
-      <w:tr>
-        <w:tc>
-          <w:tcPr/>
-          <w:p>
-            <w:pPr>
-              <w:pStyle w:val="Compact"/>
-            </w:pPr>
-            <w:r>
-              <w:rPr>
-                <w:b/>
-                <w:bCs/>
-              </w:rPr>
-              <w:t xml:space="preserve">Kling v1.6 Pro Dynamic</w:t>
-            </w:r>
-          </w:p>
-        </w:tc>
-        <w:tc>
-          <w:tcPr/>
-          <w:p>
-            <w:pPr>
-              <w:pStyle w:val="Compact"/>
-            </w:pPr>
-            <w:r>
-              <w:t xml:space="preserve">cfg=0.5 + cinematic prompt, dramatic motion</w:t>
-            </w:r>
-          </w:p>
-        </w:tc>
-        <w:tc>
-          <w:tcPr/>
-          <w:p>
-            <w:pPr>
-              <w:pStyle w:val="Compact"/>
-            </w:pPr>
-            <w:r>
-              <w:t xml:space="preserve">동일</w:t>
-            </w:r>
-          </w:p>
-        </w:tc>
-      </w:tr>
-      <w:tr>
-        <w:tc>
-          <w:tcPr/>
-          <w:p>
-            <w:pPr>
-              <w:pStyle w:val="Compact"/>
-            </w:pPr>
-            <w:r>
-              <w:rPr>
-                <w:b/>
-                <w:bCs/>
-              </w:rPr>
-              <w:t xml:space="preserve">Seedance 1 Pro (ByteDance)</w:t>
-            </w:r>
-          </w:p>
-        </w:tc>
-        <w:tc>
-          <w:tcPr/>
-          <w:p>
-            <w:pPr>
-              <w:pStyle w:val="Compact"/>
-            </w:pPr>
-            <w:r>
-              <w:t xml:space="preserve">최상위 motion handling, premium feel</w:t>
-            </w:r>
-          </w:p>
-        </w:tc>
-        <w:tc>
-          <w:tcPr/>
-          <w:p>
-            <w:pPr>
-              <w:pStyle w:val="Compact"/>
-            </w:pPr>
-            <w:r>
-              <w:t xml:space="preserve">+30%</w:t>
-            </w:r>
-          </w:p>
-        </w:tc>
-      </w:tr>
-    </w:tbl>
-    <w:p>
-      <w:pPr>
-        <w:pStyle w:val="BodyText"/>
-      </w:pPr>
-      <w:r>
-        <w:t xml:space="preserve">Smart motion prompt는 Claude Haiku 4.5가 제품 카테고리·특성을 인식해 cinematic mode prompt 자동 생성 (Apple/Dyson/Burberry 스타일). 보수적</w:t>
-      </w:r>
-      <w:r>
-        <w:t xml:space="preserve"> </w:t>
-      </w:r>
-      <w:r>
-        <w:t xml:space="preserve">“rotation only”</w:t>
-      </w:r>
-      <w:r>
-        <w:t xml:space="preserve"> </w:t>
-      </w:r>
-      <w:r>
-        <w:t xml:space="preserve">출력 회피.</w:t>
-      </w:r>
-    </w:p>
-    <w:p>
-      <w:pPr>
-        <w:pStyle w:val="BodyText"/>
-      </w:pPr>
-      <w:r>
-        <w:rPr>
-          <w:b/>
-          <w:bCs/>
-        </w:rPr>
-        <w:t xml:space="preserve">⑨ Job + Polling 비동기 아키텍처 + 영구 저장 (production-ready)</w:t>
-      </w:r>
-    </w:p>
-    <w:p>
-      <w:pPr>
-        <w:pStyle w:val="BodyText"/>
-      </w:pPr>
-      <w:r>
-        <w:t xml:space="preserve">6-8분짜리 long-running 영상 생성을 단일 HTTP 요청으로 처리하면 브라우저·edge proxy idle timeout (보통 60-300s) 으로</w:t>
-      </w:r>
-      <w:r>
-        <w:t xml:space="preserve"> </w:t>
-      </w:r>
-      <w:r>
-        <w:t xml:space="preserve">“Failed to fetch”</w:t>
-      </w:r>
-      <w:r>
-        <w:t xml:space="preserve"> </w:t>
-      </w:r>
-      <w:r>
-        <w:t xml:space="preserve">발생. 본 시스템은 다음 아키텍처:</w:t>
-      </w:r>
-    </w:p>
-    <w:p>
-      <w:pPr>
-        <w:pStyle w:val="Compact"/>
-        <w:numPr>
-          <w:ilvl w:val="0"/>
-          <w:numId w:val="1007"/>
-        </w:numPr>
-      </w:pPr>
-      <w:r>
-        <w:rPr>
-          <w:b/>
-          <w:bCs/>
-        </w:rPr>
-        <w:t xml:space="preserve">POST /api/challenge/video</w:t>
-      </w:r>
-      <w:r>
-        <w:t xml:space="preserve"> </w:t>
-      </w:r>
-      <w:r>
-        <w:t xml:space="preserve">(~30s) — Replicate prediction 생성만 후 즉시</w:t>
-      </w:r>
-      <w:r>
-        <w:t xml:space="preserve"> </w:t>
-      </w:r>
-      <w:r>
-        <w:rPr>
-          <w:rStyle w:val="VerbatimChar"/>
-        </w:rPr>
-        <w:t xml:space="preserve">job_id</w:t>
-      </w:r>
-      <w:r>
-        <w:t xml:space="preserve"> </w:t>
-      </w:r>
-      <w:r>
-        <w:t xml:space="preserve">반환</w:t>
-      </w:r>
-    </w:p>
-    <w:p>
-      <w:pPr>
-        <w:pStyle w:val="Compact"/>
-        <w:numPr>
-          <w:ilvl w:val="0"/>
-          <w:numId w:val="1007"/>
-        </w:numPr>
-      </w:pPr>
-      <w:r>
-        <w:rPr>
-          <w:b/>
-          <w:bCs/>
-        </w:rPr>
-        <w:t xml:space="preserve">GET /api/challenge/video/status?job_id=…</w:t>
-      </w:r>
-      <w:r>
-        <w:t xml:space="preserve"> </w:t>
-      </w:r>
-      <w:r>
-        <w:t xml:space="preserve">(~2s) — 클라이언트가 5초마다 polling</w:t>
-      </w:r>
-    </w:p>
-    <w:p>
-      <w:pPr>
-        <w:pStyle w:val="Compact"/>
-        <w:numPr>
-          <w:ilvl w:val="0"/>
-          <w:numId w:val="1007"/>
-        </w:numPr>
-      </w:pPr>
-      <w:r>
-        <w:rPr>
-          <w:b/>
-          <w:bCs/>
-        </w:rPr>
-        <w:t xml:space="preserve">Supabase Storage 영구 저장</w:t>
-      </w:r>
-      <w:r>
-        <w:t xml:space="preserve"> </w:t>
-      </w:r>
-      <w:r>
-        <w:t xml:space="preserve">— Replicate URL은 24h 후 만료 → 우리 storage로 mirror</w:t>
-      </w:r>
-    </w:p>
-    <w:p>
-      <w:pPr>
-        <w:pStyle w:val="Compact"/>
-        <w:numPr>
-          <w:ilvl w:val="0"/>
-          <w:numId w:val="1007"/>
-        </w:numPr>
-      </w:pPr>
-      <w:r>
-        <w:rPr>
-          <w:b/>
-          <w:bCs/>
-        </w:rPr>
-        <w:t xml:space="preserve">각 클립 다운로드/URL 복사 버튼</w:t>
-      </w:r>
-      <w:r>
-        <w:t xml:space="preserve"> </w:t>
-      </w:r>
-      <w:r>
-        <w:t xml:space="preserve">— 마케팅·SNS·발표 자료로 즉시 활용</w:t>
-      </w:r>
-    </w:p>
-    <w:p>
-      <w:pPr>
-        <w:pStyle w:val="Compact"/>
-        <w:numPr>
-          <w:ilvl w:val="0"/>
-          <w:numId w:val="1007"/>
-        </w:numPr>
-      </w:pPr>
-      <w:r>
-        <w:rPr>
-          <w:b/>
-          <w:bCs/>
-        </w:rPr>
-        <w:t xml:space="preserve">history 페이지 + ?hash= permalink</w:t>
-      </w:r>
-      <w:r>
-        <w:t xml:space="preserve"> </w:t>
-      </w:r>
-      <w:r>
-        <w:t xml:space="preserve">— 새로고침/북마크/공유 URL로 동일 결과 즉시 복원 (LLM 재호출 0)</w:t>
-      </w:r>
-    </w:p>
-    <w:p>
-      <w:pPr>
-        <w:pStyle w:val="FirstParagraph"/>
-      </w:pPr>
-      <w:r>
-        <w:t xml:space="preserve">이로써 challenge demo·심사위원 시연·실 사용자 모두 long-running 작업이 안정적으로 완료·공유 가능.</w:t>
-      </w:r>
-    </w:p>
-    <w:bookmarkEnd w:id="13"/>
-    <w:bookmarkStart w:id="14" w:name="최종-완성될-결과물의-성능-목표"/>
-    <w:p>
-      <w:pPr>
-        <w:pStyle w:val="Heading3"/>
-      </w:pPr>
-      <w:r>
-        <w:t xml:space="preserve">2-2. 최종 완성될 결과물의 성능 목표</w:t>
-      </w:r>
-    </w:p>
-    <w:tbl>
-      <w:tblPr>
-        <w:tblStyle w:val="Table"/>
-        <w:tblW w:type="pct" w:w="5000"/>
-        <w:tblLayout w:type="fixed"/>
-        <w:tblLook w:firstRow="1" w:lastRow="0" w:firstColumn="0" w:lastColumn="0" w:noHBand="0" w:noVBand="0" w:val="0020"/>
-      </w:tblPr>
-      <w:tblGrid>
-        <w:gridCol w:w="2640"/>
-        <w:gridCol w:w="2640"/>
-        <w:gridCol w:w="2640"/>
-      </w:tblGrid>
-      <w:tr>
-        <w:trPr>
-          <w:tblHeader w:val="on"/>
-        </w:trPr>
-        <w:tc>
-          <w:tcPr/>
-          <w:p>
-            <w:pPr>
-              <w:pStyle w:val="Compact"/>
-            </w:pPr>
-            <w:r>
               <w:t xml:space="preserve">지표</w:t>
             </w:r>
           </w:p>
@@ -3787,29 +3909,68 @@
                 <w:b/>
                 <w:bCs/>
               </w:rPr>
-              <w:t xml:space="preserve">Task 2 영상 옵션</w:t>
-            </w:r>
-          </w:p>
-        </w:tc>
-        <w:tc>
-          <w:tcPr/>
-          <w:p>
-            <w:pPr>
-              <w:pStyle w:val="Compact"/>
-            </w:pPr>
-            <w:r>
-              <w:t xml:space="preserve">3-tier × 3-model = 9 조합 (Kling Stable/Dynamic + Seedance 1 Pro)</w:t>
-            </w:r>
-          </w:p>
-        </w:tc>
-        <w:tc>
-          <w:tcPr/>
-          <w:p>
-            <w:pPr>
-              <w:pStyle w:val="Compact"/>
-            </w:pPr>
-            <w:r>
-              <w:t xml:space="preserve">사용자 비교 후 default 결정</w:t>
+              <w:t xml:space="preserve">Task 2 영상 모델</w:t>
+            </w:r>
+          </w:p>
+        </w:tc>
+        <w:tc>
+          <w:tcPr/>
+          <w:p>
+            <w:pPr>
+              <w:pStyle w:val="Compact"/>
+            </w:pPr>
+            <w:r>
+              <w:t xml:space="preserve">Seedance 2.0 (ByteDance, 4K·multimodal) 단일 — 사용자 prompt + AI 3-옵션 제안 (럭셔리·다이내믹·글로벌)</w:t>
+            </w:r>
+          </w:p>
+        </w:tc>
+        <w:tc>
+          <w:tcPr/>
+          <w:p>
+            <w:pPr>
+              <w:pStyle w:val="Compact"/>
+            </w:pPr>
+            <w:r>
+              <w:t xml:space="preserve">동일 유지</w:t>
+            </w:r>
+          </w:p>
+        </w:tc>
+      </w:tr>
+      <w:tr>
+        <w:tc>
+          <w:tcPr/>
+          <w:p>
+            <w:pPr>
+              <w:pStyle w:val="Compact"/>
+            </w:pPr>
+            <w:r>
+              <w:rPr>
+                <w:b/>
+                <w:bCs/>
+              </w:rPr>
+              <w:t xml:space="preserve">Task 2 영상 prompt 입력 방식</w:t>
+            </w:r>
+          </w:p>
+        </w:tc>
+        <w:tc>
+          <w:tcPr/>
+          <w:p>
+            <w:pPr>
+              <w:pStyle w:val="Compact"/>
+            </w:pPr>
+            <w:r>
+              <w:t xml:space="preserve">(1) 사용자 textarea 직접 입력 / (2) AI 옵션 3가지 클릭 선택 / (3) 미입력 시 자동 옵션 A</w:t>
+            </w:r>
+          </w:p>
+        </w:tc>
+        <w:tc>
+          <w:tcPr/>
+          <w:p>
+            <w:pPr>
+              <w:pStyle w:val="Compact"/>
+            </w:pPr>
+            <w:r>
+              <w:t xml:space="preserve">100% 사용자 통제권</w:t>
             </w:r>
           </w:p>
         </w:tc>
@@ -3865,18 +4026,18 @@
                 <w:b/>
                 <w:bCs/>
               </w:rPr>
-              <w:t xml:space="preserve">Task 2 영상 비용 (5초 기준)</w:t>
-            </w:r>
-          </w:p>
-        </w:tc>
-        <w:tc>
-          <w:tcPr/>
-          <w:p>
-            <w:pPr>
-              <w:pStyle w:val="Compact"/>
-            </w:pPr>
-            <w:r>
-              <w:t xml:space="preserve">Tier A $0.50 / Tier B $1.50 / Tier C ~$1.50 (Kling) — Seedance +30%</w:t>
+              <w:t xml:space="preserve">Task 2 영상 비용 (Seedance 2.0)</w:t>
+            </w:r>
+          </w:p>
+        </w:tc>
+        <w:tc>
+          <w:tcPr/>
+          <w:p>
+            <w:pPr>
+              <w:pStyle w:val="Compact"/>
+            </w:pPr>
+            <w:r>
+              <w:t xml:space="preserve">4초 $1.20 / 5초 $1.50 / 8초 $2.00 / 10초 $2.50 (+ AI prompt $0.003, TTS $0.005)</w:t>
             </w:r>
           </w:p>
         </w:tc>
@@ -4529,6 +4690,30 @@
               <w:pStyle w:val="Compact"/>
             </w:pPr>
             <w:r>
+              <w:t xml:space="preserve">Task 2 영상 prompt — AI 3-옵션 자동 제안 (Claude Haiku, 선택)</w:t>
+            </w:r>
+          </w:p>
+        </w:tc>
+        <w:tc>
+          <w:tcPr/>
+          <w:p>
+            <w:pPr>
+              <w:pStyle w:val="Compact"/>
+            </w:pPr>
+            <w:r>
+              <w:t xml:space="preserve">$0.003</w:t>
+            </w:r>
+          </w:p>
+        </w:tc>
+      </w:tr>
+      <w:tr>
+        <w:tc>
+          <w:tcPr/>
+          <w:p>
+            <w:pPr>
+              <w:pStyle w:val="Compact"/>
+            </w:pPr>
+            <w:r>
               <w:t xml:space="preserve">Task 2 영상 —</w:t>
             </w:r>
             <w:r>
@@ -4539,24 +4724,18 @@
                 <w:b/>
                 <w:bCs/>
               </w:rPr>
-              <w:t xml:space="preserve">Tier A 5초</w:t>
-            </w:r>
-            <w:r>
-              <w:t xml:space="preserve"> </w:t>
-            </w:r>
-            <w:r>
-              <w:t xml:space="preserve">(Kling Stable/Dynamic, smart Haiku 포함)</w:t>
-            </w:r>
-          </w:p>
-        </w:tc>
-        <w:tc>
-          <w:tcPr/>
-          <w:p>
-            <w:pPr>
-              <w:pStyle w:val="Compact"/>
-            </w:pPr>
-            <w:r>
-              <w:t xml:space="preserve">$0.50</w:t>
+              <w:t xml:space="preserve">Seedance 2.0 · 4초</w:t>
+            </w:r>
+          </w:p>
+        </w:tc>
+        <w:tc>
+          <w:tcPr/>
+          <w:p>
+            <w:pPr>
+              <w:pStyle w:val="Compact"/>
+            </w:pPr>
+            <w:r>
+              <w:t xml:space="preserve">$1.20</w:t>
             </w:r>
           </w:p>
         </w:tc>
@@ -4579,24 +4758,18 @@
                 <w:b/>
                 <w:bCs/>
               </w:rPr>
-              <w:t xml:space="preserve">Tier A 5초</w:t>
-            </w:r>
-            <w:r>
-              <w:t xml:space="preserve"> </w:t>
-            </w:r>
-            <w:r>
-              <w:t xml:space="preserve">(Seedance 1 Pro)</w:t>
-            </w:r>
-          </w:p>
-        </w:tc>
-        <w:tc>
-          <w:tcPr/>
-          <w:p>
-            <w:pPr>
-              <w:pStyle w:val="Compact"/>
-            </w:pPr>
-            <w:r>
-              <w:t xml:space="preserve">$0.65</w:t>
+              <w:t xml:space="preserve">Seedance 2.0 · 5초</w:t>
+            </w:r>
+          </w:p>
+        </w:tc>
+        <w:tc>
+          <w:tcPr/>
+          <w:p>
+            <w:pPr>
+              <w:pStyle w:val="Compact"/>
+            </w:pPr>
+            <w:r>
+              <w:t xml:space="preserve">$1.50</w:t>
             </w:r>
           </w:p>
         </w:tc>
@@ -4619,24 +4792,24 @@
                 <w:b/>
                 <w:bCs/>
               </w:rPr>
-              <w:t xml:space="preserve">Tier B 5초 × 3</w:t>
+              <w:t xml:space="preserve">Seedance 2.0 · 8초</w:t>
             </w:r>
             <w:r>
               <w:t xml:space="preserve"> </w:t>
             </w:r>
             <w:r>
-              <w:t xml:space="preserve">(스토리보드, Kling sequential)</w:t>
-            </w:r>
-          </w:p>
-        </w:tc>
-        <w:tc>
-          <w:tcPr/>
-          <w:p>
-            <w:pPr>
-              <w:pStyle w:val="Compact"/>
-            </w:pPr>
-            <w:r>
-              <w:t xml:space="preserve">$1.50</w:t>
+              <w:t xml:space="preserve">(default)</w:t>
+            </w:r>
+          </w:p>
+        </w:tc>
+        <w:tc>
+          <w:tcPr/>
+          <w:p>
+            <w:pPr>
+              <w:pStyle w:val="Compact"/>
+            </w:pPr>
+            <w:r>
+              <w:t xml:space="preserve">$2.00</w:t>
             </w:r>
           </w:p>
         </w:tc>
@@ -4659,53 +4832,31 @@
                 <w:b/>
                 <w:bCs/>
               </w:rPr>
-              <w:t xml:space="preserve">Tier B 5초 × 3</w:t>
-            </w:r>
-            <w:r>
-              <w:t xml:space="preserve"> </w:t>
-            </w:r>
-            <w:r>
-              <w:t xml:space="preserve">(Seedance)</w:t>
-            </w:r>
-          </w:p>
-        </w:tc>
-        <w:tc>
-          <w:tcPr/>
-          <w:p>
-            <w:pPr>
-              <w:pStyle w:val="Compact"/>
-            </w:pPr>
-            <w:r>
-              <w:t xml:space="preserve">$1.95</w:t>
-            </w:r>
-          </w:p>
-        </w:tc>
-      </w:tr>
-      <w:tr>
-        <w:tc>
-          <w:tcPr/>
-          <w:p>
-            <w:pPr>
-              <w:pStyle w:val="Compact"/>
-            </w:pPr>
-            <w:r>
-              <w:t xml:space="preserve">Task 2 영상 —</w:t>
-            </w:r>
-            <w:r>
-              <w:t xml:space="preserve"> </w:t>
-            </w:r>
-            <w:r>
-              <w:rPr>
-                <w:b/>
-                <w:bCs/>
-              </w:rPr>
-              <w:t xml:space="preserve">Tier C</w:t>
-            </w:r>
-            <w:r>
-              <w:t xml:space="preserve"> </w:t>
-            </w:r>
-            <w:r>
-              <w:t xml:space="preserve">Tier B + OpenAI TTS Nova 한국어</w:t>
+              <w:t xml:space="preserve">Seedance 2.0 · 10초</w:t>
+            </w:r>
+          </w:p>
+        </w:tc>
+        <w:tc>
+          <w:tcPr/>
+          <w:p>
+            <w:pPr>
+              <w:pStyle w:val="Compact"/>
+            </w:pPr>
+            <w:r>
+              <w:t xml:space="preserve">$2.50</w:t>
+            </w:r>
+          </w:p>
+        </w:tc>
+      </w:tr>
+      <w:tr>
+        <w:tc>
+          <w:tcPr/>
+          <w:p>
+            <w:pPr>
+              <w:pStyle w:val="Compact"/>
+            </w:pPr>
+            <w:r>
+              <w:t xml:space="preserve">Task 2 영상 — + 한국어 TTS 보이스오버 (Nova, 선택)</w:t>
             </w:r>
           </w:p>
         </w:tc>
@@ -4717,40 +4868,6 @@
             </w:pPr>
             <w:r>
               <w:t xml:space="preserve">+$0.005</w:t>
-            </w:r>
-          </w:p>
-        </w:tc>
-      </w:tr>
-      <w:tr>
-        <w:tc>
-          <w:tcPr/>
-          <w:p>
-            <w:pPr>
-              <w:pStyle w:val="Compact"/>
-            </w:pPr>
-            <w:r>
-              <w:t xml:space="preserve">Task 2 영상 —</w:t>
-            </w:r>
-            <w:r>
-              <w:t xml:space="preserve"> </w:t>
-            </w:r>
-            <w:r>
-              <w:rPr>
-                <w:b/>
-                <w:bCs/>
-              </w:rPr>
-              <w:t xml:space="preserve">10초 옵션</w:t>
-            </w:r>
-          </w:p>
-        </w:tc>
-        <w:tc>
-          <w:tcPr/>
-          <w:p>
-            <w:pPr>
-              <w:pStyle w:val="Compact"/>
-            </w:pPr>
-            <w:r>
-              <w:t xml:space="preserve">× 2 (예: Tier B 10초 $3.00)</w:t>
             </w:r>
           </w:p>
         </w:tc>
@@ -4823,39 +4940,7 @@
                 <w:b/>
                 <w:bCs/>
               </w:rPr>
-              <w:t xml:space="preserve">합계 (Tier A 5초 영상 Kling Stable 포함)</w:t>
-            </w:r>
-          </w:p>
-        </w:tc>
-        <w:tc>
-          <w:tcPr/>
-          <w:p>
-            <w:pPr>
-              <w:pStyle w:val="Compact"/>
-            </w:pPr>
-            <w:r>
-              <w:rPr>
-                <w:b/>
-                <w:bCs/>
-              </w:rPr>
-              <w:t xml:space="preserve">$0.87</w:t>
-            </w:r>
-          </w:p>
-        </w:tc>
-      </w:tr>
-      <w:tr>
-        <w:tc>
-          <w:tcPr/>
-          <w:p>
-            <w:pPr>
-              <w:pStyle w:val="Compact"/>
-            </w:pPr>
-            <w:r>
-              <w:rPr>
-                <w:b/>
-                <w:bCs/>
-              </w:rPr>
-              <w:t xml:space="preserve">합계 (Tier B 5초 × 3 영상 Kling 포함, 권장)</w:t>
+              <w:t xml:space="preserve">합계 (Seedance 2.0 5초 영상 포함)</w:t>
             </w:r>
           </w:p>
         </w:tc>
@@ -4887,7 +4972,7 @@
                 <w:b/>
                 <w:bCs/>
               </w:rPr>
-              <w:t xml:space="preserve">합계 (Tier C 5초 × 3 + TTS, 최대)</w:t>
+              <w:t xml:space="preserve">합계 (Seedance 2.0 8초 영상 + AI 제안 + TTS, 권장)</w:t>
             </w:r>
           </w:p>
         </w:tc>
@@ -4902,7 +4987,39 @@
                 <w:b/>
                 <w:bCs/>
               </w:rPr>
-              <w:t xml:space="preserve">$1.88</w:t>
+              <w:t xml:space="preserve">$2.39</w:t>
+            </w:r>
+          </w:p>
+        </w:tc>
+      </w:tr>
+      <w:tr>
+        <w:tc>
+          <w:tcPr/>
+          <w:p>
+            <w:pPr>
+              <w:pStyle w:val="Compact"/>
+            </w:pPr>
+            <w:r>
+              <w:rPr>
+                <w:b/>
+                <w:bCs/>
+              </w:rPr>
+              <w:t xml:space="preserve">합계 (Seedance 2.0 10초 영상 + AI 제안 + TTS, 최대)</w:t>
+            </w:r>
+          </w:p>
+        </w:tc>
+        <w:tc>
+          <w:tcPr/>
+          <w:p>
+            <w:pPr>
+              <w:pStyle w:val="Compact"/>
+            </w:pPr>
+            <w:r>
+              <w:rPr>
+                <w:b/>
+                <w:bCs/>
+              </w:rPr>
+              <w:t xml:space="preserve">$2.89</w:t>
             </w:r>
           </w:p>
         </w:tc>
@@ -4913,7 +5030,7 @@
         <w:pStyle w:val="BodyText"/>
       </w:pPr>
       <w:r>
-        <w:t xml:space="preserve">(영상 비용은 회당 1회 호출 기준. 동일 입력 재호출 시 Supabase 영구 저장으로 LLM·Replicate 호출 비용 0. ?hash= permalink로 무한 재열람 가능.)</w:t>
+        <w:t xml:space="preserve">(영상 비용은 회당 1회 호출 기준. 동일 입력 재호출 시 Supabase 영구 저장으로 LLM·Replicate 호출 비용 0. ?hash= permalink로 무한 재열람 가능. Seedance 2.0은 1 Pro 대비 cinematic motion / 4K resolution 대폭 향상으로 1.5x 가치 — 외주 영상 30만~100만 원 대비 99.5% 절감.)</w:t>
       </w:r>
     </w:p>
     <w:p>

</xml_diff>